<commit_message>
Enhance portfolio from improved resume
</commit_message>
<xml_diff>
--- a/assets/Junaid-Irfan-Resume.docx
+++ b/assets/Junaid-Irfan-Resume.docx
@@ -31,7 +31,7 @@
           <w:sz w:val="22"/>
           <w:szCs w:val="22"/>
         </w:rPr>
-        <w:t xml:space="preserve">Full Stack Developer  ·  MERN Stack  ·  AI-Assisted Development</w:t>
+        <w:t xml:space="preserve">Full Stack Developer  ·  MERN Stack  ·  AI Engineering</w:t>
       </w:r>
     </w:p>
     <w:p>
@@ -75,7 +75,7 @@
         </w:rPr>
         <w:t xml:space="preserve">  |  </w:t>
       </w:r>
-      <w:hyperlink w:history="1" r:id="rIdndu0hw-vj38aeo7bokwsq">
+      <w:hyperlink w:history="1" r:id="rId51tc_vxtp96jq8kbbjpir">
         <w:r>
           <w:rPr>
             <w:rStyle w:val="Hyperlink"/>
@@ -97,7 +97,7 @@
         </w:rPr>
         <w:t xml:space="preserve">  |  </w:t>
       </w:r>
-      <w:hyperlink w:history="1" r:id="rId43267qrbyo4mp61zglzn5">
+      <w:hyperlink w:history="1" r:id="rIdqobvbyjtsii8wyshh8lrp">
         <w:r>
           <w:rPr>
             <w:rStyle w:val="Hyperlink"/>
@@ -119,7 +119,7 @@
         </w:rPr>
         <w:t xml:space="preserve">  |  </w:t>
       </w:r>
-      <w:hyperlink w:history="1" r:id="rIdh99osoibdxk_uozilvftu">
+      <w:hyperlink w:history="1" r:id="rIdmwvg_9mlddbxbpx5pbwye">
         <w:r>
           <w:rPr>
             <w:rStyle w:val="Hyperlink"/>
@@ -171,7 +171,7 @@
           <w:sz w:val="20"/>
           <w:szCs w:val="20"/>
         </w:rPr>
-        <w:t xml:space="preserve">MERN Stack Developer with 30+ project builds spanning e-commerce platforms, role-based dashboards, job portals, and booking systems. Focused on clean, responsive UI, REST API design, and shipping client-ready products. Experienced with AI-assisted development workflows using Claude and ChatGPT to accelerate delivery and code quality.</w:t>
+        <w:t xml:space="preserve">Motivated Full Stack Developer currently interning at devWeekens as a Full Stack AI Engineering Intern. Passionate about building real-world MERN stack applications, with hands-on project experience in e-commerce platforms, role-based dashboards, and job portals. Actively deepening skills in AI-driven development and Data Structures &amp; Algorithms while seeking a junior role to grow and contribute.</w:t>
       </w:r>
     </w:p>
     <w:p>
@@ -331,16 +331,16 @@
           <w:sz w:val="20"/>
           <w:szCs w:val="20"/>
         </w:rPr>
-        <w:t xml:space="preserve">AI-Assisted Dev: </w:t>
-      </w:r>
-      <w:r>
-        <w:rPr>
-          <w:rFonts w:ascii="Arial" w:cs="Arial" w:eastAsia="Arial" w:hAnsi="Arial"/>
-          <w:color w:val="555555"/>
-          <w:sz w:val="20"/>
-          <w:szCs w:val="20"/>
-        </w:rPr>
-        <w:t xml:space="preserve">Claude, ChatGPT, Codex, DeepSeek — used for workflow acceleration</w:t>
+        <w:t xml:space="preserve">AI Integration: </w:t>
+      </w:r>
+      <w:r>
+        <w:rPr>
+          <w:rFonts w:ascii="Arial" w:cs="Arial" w:eastAsia="Arial" w:hAnsi="Arial"/>
+          <w:color w:val="555555"/>
+          <w:sz w:val="20"/>
+          <w:szCs w:val="20"/>
+        </w:rPr>
+        <w:t xml:space="preserve">OpenAI API, Claude API, Codex, DeepSeek — building AI-powered features</w:t>
       </w:r>
     </w:p>
     <w:p>
@@ -375,16 +375,16 @@
           <w:sz w:val="22"/>
           <w:szCs w:val="22"/>
         </w:rPr>
-        <w:t xml:space="preserve">Full Stack Developer</w:t>
-      </w:r>
-      <w:r>
-        <w:rPr>
-          <w:rFonts w:ascii="Arial" w:cs="Arial" w:eastAsia="Arial" w:hAnsi="Arial"/>
-          <w:color w:val="555555"/>
-          <w:sz w:val="20"/>
-          <w:szCs w:val="20"/>
-        </w:rPr>
-        <w:t xml:space="preserve">  —  Portfolio &amp; Freelance Projects</w:t>
+        <w:t xml:space="preserve">Full Stack AI Engineering Intern</w:t>
+      </w:r>
+      <w:r>
+        <w:rPr>
+          <w:rFonts w:ascii="Arial" w:cs="Arial" w:eastAsia="Arial" w:hAnsi="Arial"/>
+          <w:color w:val="555555"/>
+          <w:sz w:val="20"/>
+          <w:szCs w:val="20"/>
+        </w:rPr>
+        <w:t xml:space="preserve">  —  devWeekens</w:t>
       </w:r>
       <w:r>
         <w:rPr>
@@ -393,7 +393,7 @@
           <w:sz w:val="19"/>
           <w:szCs w:val="19"/>
         </w:rPr>
-        <w:t xml:space="preserve">  |  2023 – Present</w:t>
+        <w:t xml:space="preserve">  |  Remote  |  June 2026 – Present</w:t>
       </w:r>
     </w:p>
     <w:p>
@@ -412,7 +412,7 @@
           <w:sz w:val="20"/>
           <w:szCs w:val="20"/>
         </w:rPr>
-        <w:t xml:space="preserve">Built and deployed 30+ projects; selected working demos prepared for recruiter and marketplace review.</w:t>
+        <w:t xml:space="preserve">Integrating AI APIs (OpenAI, Claude) into full stack web applications to build intelligent, AI-powered features.</w:t>
       </w:r>
     </w:p>
     <w:p>
@@ -431,7 +431,7 @@
           <w:sz w:val="20"/>
           <w:szCs w:val="20"/>
         </w:rPr>
-        <w:t xml:space="preserve">Delivered responsive UIs, REST API integrations, CRUD workflows, auth systems, and admin dashboards.</w:t>
+        <w:t xml:space="preserve">Developing React frontend components and Node.js/Express backend APIs as part of real engineering tasks.</w:t>
       </w:r>
     </w:p>
     <w:p>
@@ -450,7 +450,7 @@
           <w:sz w:val="20"/>
           <w:szCs w:val="20"/>
         </w:rPr>
-        <w:t xml:space="preserve">Provided freelance services on Upwork/Fiverr: landing pages, personal brand sites, booking flows, bug fixes.</w:t>
+        <w:t xml:space="preserve">Practising Data Structures &amp; Algorithms daily — covering arrays, linked lists, recursion, and problem-solving patterns.</w:t>
       </w:r>
     </w:p>
     <w:p>
@@ -469,7 +469,7 @@
           <w:sz w:val="20"/>
           <w:szCs w:val="20"/>
         </w:rPr>
-        <w:t xml:space="preserve">Maintained clean code handoff with GitHub repositories, Vercel deployments, and client-ready documentation.</w:t>
+        <w:t xml:space="preserve">Working remotely in a structured internship program with code reviews, task assignments, and collaborative delivery.</w:t>
       </w:r>
     </w:p>
     <w:p>
@@ -569,7 +569,7 @@
         </w:rPr>
         <w:t xml:space="preserve">Live: </w:t>
       </w:r>
-      <w:hyperlink w:history="1" r:id="rIdpvyrljam1fdlb28xfqrh9">
+      <w:hyperlink w:history="1" r:id="rIdqgtktczew0ovzdc0_enaz">
         <w:r>
           <w:rPr>
             <w:rStyle w:val="Hyperlink"/>
@@ -661,7 +661,7 @@
         </w:rPr>
         <w:t xml:space="preserve">Live: </w:t>
       </w:r>
-      <w:hyperlink w:history="1" r:id="rIdpswb7jezbfvxe_jjdtv7j">
+      <w:hyperlink w:history="1" r:id="rId6bzcuhdfc4vuhxc8fgmr4">
         <w:r>
           <w:rPr>
             <w:rStyle w:val="Hyperlink"/>
@@ -685,7 +685,7 @@
         </w:rPr>
         <w:t xml:space="preserve">   Code: </w:t>
       </w:r>
-      <w:hyperlink w:history="1" r:id="rId7hdy_-srwv26wmgdtgu6s">
+      <w:hyperlink w:history="1" r:id="rIdscuhvacgvd_1bkktvi-je">
         <w:r>
           <w:rPr>
             <w:rStyle w:val="Hyperlink"/>
@@ -777,7 +777,7 @@
         </w:rPr>
         <w:t xml:space="preserve">Live: </w:t>
       </w:r>
-      <w:hyperlink w:history="1" r:id="rIdvrfe-voakptepeqj2ogpw">
+      <w:hyperlink w:history="1" r:id="rIdsxnhhuvzevlvkxlp2bdqx">
         <w:r>
           <w:rPr>
             <w:rStyle w:val="Hyperlink"/>
@@ -801,7 +801,7 @@
         </w:rPr>
         <w:t xml:space="preserve">   Code: </w:t>
       </w:r>
-      <w:hyperlink w:history="1" r:id="rId-khfe7aa-nh4vd_ul-yol">
+      <w:hyperlink w:history="1" r:id="rId0xscc9hhgkvr0olzb5jxp">
         <w:r>
           <w:rPr>
             <w:rStyle w:val="Hyperlink"/>
@@ -856,7 +856,7 @@
           <w:sz w:val="20"/>
           <w:szCs w:val="20"/>
         </w:rPr>
-        <w:t xml:space="preserve">  |  Lahore Leads University  |  Expected 2025</w:t>
+        <w:t xml:space="preserve">  |  Lahore Leads University  |  2020 – 2025</w:t>
       </w:r>
     </w:p>
     <w:p>

</xml_diff>